<commit_message>
docs: clarify Apple Bento Grid & Dynamic Color-Sync UI, remove unneeded 3D WebGL references
</commit_message>
<xml_diff>
--- a/CAM_NANG_VAN_DAP_THI_AI.docx
+++ b/CAM_NANG_VAN_DAP_THI_AI.docx
@@ -48,7 +48,7 @@
           <w:color w:val="0D9488"/>
           <w:sz w:val="26"/>
         </w:rPr>
-        <w:t>HỆ THỐNG THẾ GIỚI IPHONE (ZSHOP) - SINGLE-STORE 3D RETAIL &amp; MULTI-AGENT RAG</w:t>
+        <w:t>HỆ THỐNG THẾ GIỚI IPHONE (ZSHOP) - BENTO GRID RETAIL &amp; MULTI-AGENT RAG</w:t>
       </w:r>
     </w:p>
     <w:p>
@@ -66,7 +66,7 @@
         <w:br/>
         <w:t>Trưởng nhóm: Nguyễn Quốc Khánh (MSSV: DTC245220042) - Phụ trách Backend, CSDL 3NF, SZ-Payment, Multi-Agent RAG Python &amp; Critic Gate</w:t>
         <w:br/>
-        <w:t>Thành viên: Mẫn Bá Hảo - Phụ trách Storefront React 19, 3D Canvas, Portal 4 Vai trò, Giỏ hàng &amp; Luồng Đổi trả/Nhập kho</w:t>
+        <w:t>Thành viên: Mẫn Bá Hảo - Phụ trách Storefront React 19, Apple Bento Grid, Portal 4 Vai trò, Giỏ hàng &amp; Luồng Đổi trả/Nhập kho</w:t>
         <w:br/>
         <w:t>Thời gian vấn đáp: Ngày 29/10/2026 | Phiên bản hệ thống: V2.0 (Đồng bộ 100% mã nguồn thực tế)</w:t>
       </w:r>
@@ -681,7 +681,7 @@
           <w:color w:val="1E293B"/>
           <w:sz w:val="20"/>
         </w:rPr>
-        <w:t>Hệ thống phân quyền theo ma trận RBAC với 4 tác nhân chuẩn UML 2.5: (1) CUSTOMER: Mua sắm 3D, chat AI, đặt hàng, tích điểm VIP; (2) SALES: Nhân viên bán hàng tại quầy POS, tra cứu CRM VIP, duyệt đổi trả 1-1; (3) WAREHOUSE: Lập phiếu nhập kho chuẩn NK-YYYY-XXXX, kiểm kho, sử dụng AI Stock Copilot; (4) ADMIN: Toàn quyền quản trị, xem báo cáo doanh thu và ra quyết định cùng AI BI. Yêu cầu phi chức năng (NFR): Tốc độ phản hồi API &lt; 500ms, cơ chế 3-Tier Smart Offline Fallback đảm bảo vận hành 100% không gián đoạn.</w:t>
+        <w:t>Hệ thống phân quyền theo ma trận RBAC với 4 tác nhân chuẩn UML 2.5: (1) CUSTOMER: Mua sắm online, chat AI, đặt hàng, tích điểm VIP; (2) SALES: Nhân viên bán hàng tại quầy POS, tra cứu CRM VIP, duyệt đổi trả 1-1; (3) WAREHOUSE: Lập phiếu nhập kho chuẩn NK-YYYY-XXXX, kiểm kho, sử dụng AI Stock Copilot; (4) ADMIN: Toàn quyền quản trị, xem báo cáo doanh thu và ra quyết định cùng AI BI. Yêu cầu phi chức năng (NFR): Tốc độ phản hồi API &lt; 500ms, cơ chế 3-Tier Smart Offline Fallback đảm bảo vận hành 100% không gián đoạn.</w:t>
       </w:r>
     </w:p>
     <w:p>
@@ -1432,7 +1432,7 @@
           <w:color w:val="1E293B"/>
           <w:sz w:val="20"/>
         </w:rPr>
-        <w:t>Giao diện Bento Grid đậm chất Apple, tích hợp không gian 3D tương tác xoay 360 độ, Chatbot UI chia 4 Tab tiện lợi, định dạng tiền tệ formatVND() chuẩn mực không vỡ khung.</w:t>
+        <w:t>Giao diện Bento Grid đậm chất Apple Store, tích hợp công nghệ Đồng bộ Màu sắc Động (Dynamic Color-Sync Engine), Chatbot UI chia 4 Tab tiện lợi, định dạng tiền tệ formatVND() chuẩn mực không vỡ khung.</w:t>
       </w:r>
     </w:p>
     <w:p>
@@ -1701,7 +1701,7 @@
           <w:color w:val="1E293B"/>
           <w:sz w:val="20"/>
         </w:rPr>
-        <w:t>Phụ trách Frontend React 19 (Showroom 3D iPhone, Bento Grid, ChatBot UI 4 Tab), xây dựng giao diện phân quyền 4 tác nhân (Admin Dashboard, CSKH/POS Portal, Warehouse Portal), Giỏ hàng thông minh và quy trình Đổi trả kèm Thu hồi điểm tích lũy VIP.</w:t>
+        <w:t>Phụ trách Frontend React 19 (Showroom Apple Bento Grid, Dynamic Color-Sync, ChatBot UI 4 Tab), xây dựng giao diện phân quyền 4 tác nhân (Admin Dashboard, CSKH/POS Portal, Warehouse Portal), Giỏ hàng thông minh và quy trình Đổi trả kèm Thu hồi điểm tích lũy VIP.</w:t>
       </w:r>
     </w:p>
     <w:p>

</xml_diff>